<commit_message>
Generalize the onboarding guide and partnership agreement for sub-Saharan Africa; add Ghana (Open Mind Africa)
Co-Authored-By: Claude Sonnet 5.5 <noreply@anthropic.com>
</commit_message>
<xml_diff>
--- a/docs/forms/Partnership agreement.docx
+++ b/docs/forms/Partnership agreement.docx
@@ -718,7 +718,16 @@
         <w:t>vAI</w:t>
       </w:r>
       <w:r>
-        <w:t xml:space="preserve"> (which runs the platform) each have responsibilities under the data protection laws that apply (for example, Nigeria's Data Protection Act 2023, Kenya's Data Protection Act 2019, the US children's privacy rule). Schedule D lists them. Community data belongs to the community.</w:t>
+        <w:t xml:space="preserve"> (which runs the platform) each have responsibilities under the data protection laws that apply (for example Nigeria's Data Protection Act 2023, Kenya's Data Protection Act 2019, Ghana's Data Protection Act 2012, or the law of the Organization's own country, and the US children's privacy rule where it applies). The Organization tells vAI which law and regulator apply (Schedule B), and the two sides will follow whichever is stricter. If the law requires the Organization to </w:t>
+      </w:r>
+      <w:r>
+        <w:rPr>
+          <w:b/>
+        </w:rPr>
+        <w:t>register</w:t>
+      </w:r>
+      <w:r>
+        <w:t xml:space="preserve"> with its data protection regulator, the Organization will do so. Schedule D lists them. Community data belongs to the community.</w:t>
       </w:r>
     </w:p>
     <w:p>
@@ -810,7 +819,7 @@
         <w:t>within 24 hours</w:t>
       </w:r>
       <w:r>
-        <w:t xml:space="preserve"> of learning of a problem that may affect learners' information, so that the legal deadline (72 hours to the regulator in Nigeria and Kenya) can be met.</w:t>
+        <w:t xml:space="preserve"> of learning of a problem that may affect learners' information, so that the deadline set by the Organization's country (72 hours to the regulator in Nigeria and Kenya) can be met.</w:t>
       </w:r>
     </w:p>
     <w:p>
@@ -1064,7 +1073,7 @@
         <w:rPr>
           <w:b/>
         </w:rPr>
-        <w:t>[governing law, for example the State of Ohio, USA, or the Organization's country; to be agreed]</w:t>
+        <w:t>[governing law, for example the State of Ohio, USA, or the Organization's country such as Nigeria, Kenya or Ghana; to be agreed]</w:t>
       </w:r>
       <w:r>
         <w:t xml:space="preserve">. </w:t>
@@ -1911,7 +1920,39 @@
               <w:rPr>
                 <w:sz w:val="18"/>
               </w:rPr>
-              <w:t>Languages learners use; national curriculum or examinations to support</w:t>
+              <w:t>Languages learners use; national curriculum or examinations to support (for example WAEC/WASSCE, KCSE)</w:t>
+            </w:r>
+          </w:p>
+        </w:tc>
+        <w:tc>
+          <w:tcPr>
+            <w:tcW w:type="dxa" w:w="4706"/>
+          </w:tcPr>
+          <w:p>
+            <w:r>
+              <w:rPr>
+                <w:sz w:val="18"/>
+              </w:rPr>
+            </w:r>
+          </w:p>
+        </w:tc>
+      </w:tr>
+      <w:tr>
+        <w:tc>
+          <w:tcPr>
+            <w:tcW w:type="dxa" w:w="4706"/>
+          </w:tcPr>
+          <w:p>
+            <w:r>
+              <w:rPr>
+                <w:sz w:val="18"/>
+              </w:rPr>
+            </w:r>
+            <w:r>
+              <w:rPr>
+                <w:sz w:val="18"/>
+              </w:rPr>
+              <w:t>Data protection law and regulator that apply in your country; are you registered with the regulator?</w:t>
             </w:r>
           </w:p>
         </w:tc>

</xml_diff>

<commit_message>
Generalize the onboarding guide and partnership agreement for sub-Saharan Africa; add Ghana (Open Mind Africa) (#293)
Co-authored-by: Claude Sonnet 5.5 <noreply@anthropic.com>
</commit_message>
<xml_diff>
--- a/docs/forms/Partnership agreement.docx
+++ b/docs/forms/Partnership agreement.docx
@@ -718,7 +718,16 @@
         <w:t>vAI</w:t>
       </w:r>
       <w:r>
-        <w:t xml:space="preserve"> (which runs the platform) each have responsibilities under the data protection laws that apply (for example, Nigeria's Data Protection Act 2023, Kenya's Data Protection Act 2019, the US children's privacy rule). Schedule D lists them. Community data belongs to the community.</w:t>
+        <w:t xml:space="preserve"> (which runs the platform) each have responsibilities under the data protection laws that apply (for example Nigeria's Data Protection Act 2023, Kenya's Data Protection Act 2019, Ghana's Data Protection Act 2012, or the law of the Organization's own country, and the US children's privacy rule where it applies). The Organization tells vAI which law and regulator apply (Schedule B), and the two sides will follow whichever is stricter. If the law requires the Organization to </w:t>
+      </w:r>
+      <w:r>
+        <w:rPr>
+          <w:b/>
+        </w:rPr>
+        <w:t>register</w:t>
+      </w:r>
+      <w:r>
+        <w:t xml:space="preserve"> with its data protection regulator, the Organization will do so. Schedule D lists them. Community data belongs to the community.</w:t>
       </w:r>
     </w:p>
     <w:p>
@@ -810,7 +819,7 @@
         <w:t>within 24 hours</w:t>
       </w:r>
       <w:r>
-        <w:t xml:space="preserve"> of learning of a problem that may affect learners' information, so that the legal deadline (72 hours to the regulator in Nigeria and Kenya) can be met.</w:t>
+        <w:t xml:space="preserve"> of learning of a problem that may affect learners' information, so that the deadline set by the Organization's country (72 hours to the regulator in Nigeria and Kenya) can be met.</w:t>
       </w:r>
     </w:p>
     <w:p>
@@ -1064,7 +1073,7 @@
         <w:rPr>
           <w:b/>
         </w:rPr>
-        <w:t>[governing law, for example the State of Ohio, USA, or the Organization's country; to be agreed]</w:t>
+        <w:t>[governing law, for example the State of Ohio, USA, or the Organization's country such as Nigeria, Kenya or Ghana; to be agreed]</w:t>
       </w:r>
       <w:r>
         <w:t xml:space="preserve">. </w:t>
@@ -1911,7 +1920,39 @@
               <w:rPr>
                 <w:sz w:val="18"/>
               </w:rPr>
-              <w:t>Languages learners use; national curriculum or examinations to support</w:t>
+              <w:t>Languages learners use; national curriculum or examinations to support (for example WAEC/WASSCE, KCSE)</w:t>
+            </w:r>
+          </w:p>
+        </w:tc>
+        <w:tc>
+          <w:tcPr>
+            <w:tcW w:type="dxa" w:w="4706"/>
+          </w:tcPr>
+          <w:p>
+            <w:r>
+              <w:rPr>
+                <w:sz w:val="18"/>
+              </w:rPr>
+            </w:r>
+          </w:p>
+        </w:tc>
+      </w:tr>
+      <w:tr>
+        <w:tc>
+          <w:tcPr>
+            <w:tcW w:type="dxa" w:w="4706"/>
+          </w:tcPr>
+          <w:p>
+            <w:r>
+              <w:rPr>
+                <w:sz w:val="18"/>
+              </w:rPr>
+            </w:r>
+            <w:r>
+              <w:rPr>
+                <w:sz w:val="18"/>
+              </w:rPr>
+              <w:t>Data protection law and regulator that apply in your country; are you registered with the regulator?</w:t>
             </w:r>
           </w:p>
         </w:tc>

</xml_diff>

<commit_message>
Partnership agreement: vAI party is the Davidson AI Futures Lab (Mr. Bennywhite Davidson, Oloibiri); drop Impact Mining assignment; require site leader and child safety officer contacts incl. safety officer WhatsApp
Co-Authored-By: Claude Sonnet 5.5 <noreply@anthropic.com>
</commit_message>
<xml_diff>
--- a/docs/forms/Partnership agreement.docx
+++ b/docs/forms/Partnership agreement.docx
@@ -47,22 +47,25 @@
     </w:p>
     <w:p>
       <w:r>
-        <w:rPr>
-          <w:b/>
-        </w:rPr>
-        <w:t>vAI</w:t>
-      </w:r>
-      <w:r>
-        <w:t xml:space="preserve">, the nextVillage.community program, run by </w:t>
+        <w:t xml:space="preserve">The </w:t>
       </w:r>
       <w:r>
         <w:rPr>
           <w:b/>
         </w:rPr>
-        <w:t>Kevin Hallinan</w:t>
+        <w:t>Davidson AI Futures Lab</w:t>
       </w:r>
       <w:r>
-        <w:t>, 1629 E. 4th St., Dayton, OH 45403, USA, with the Davidson AI Futures Lab, Oloibiri, Bayelsa State, Nigeria ("</w:t>
+        <w:t xml:space="preserve">, of Oloibiri, Bayelsa State, Nigeria, led by </w:t>
+      </w:r>
+      <w:r>
+        <w:rPr>
+          <w:b/>
+        </w:rPr>
+        <w:t>Mr. Bennywhite Davidson</w:t>
+      </w:r>
+      <w:r>
+        <w:t xml:space="preserve">, which runs the nextVillage.community program ("</w:t>
       </w:r>
       <w:r>
         <w:rPr>
@@ -71,16 +74,7 @@
         <w:t>vAI</w:t>
       </w:r>
       <w:r>
-        <w:t xml:space="preserve">"). vAI expects to assign this agreement to </w:t>
-      </w:r>
-      <w:r>
-        <w:rPr>
-          <w:b/>
-        </w:rPr>
-        <w:t>Impact Mining, Inc.</w:t>
-      </w:r>
-      <w:r>
-        <w:t>, an Ohio nonprofit now being formed, and the Organization agrees to that assignment (clause 14);</w:t>
+        <w:t xml:space="preserve">");</w:t>
       </w:r>
     </w:p>
     <w:p>
@@ -338,16 +332,16 @@
         <w:t>lead mentor</w:t>
       </w:r>
       <w:r>
-        <w:t xml:space="preserve"> from the Organization who is present when learners are, a named </w:t>
+        <w:t xml:space="preserve"> from the Organization who is present when learners are, one or more named </w:t>
       </w:r>
       <w:r>
         <w:rPr>
           <w:b/>
         </w:rPr>
-        <w:t>primary leader</w:t>
+        <w:t>site leaders</w:t>
       </w:r>
       <w:r>
-        <w:t xml:space="preserve"> for the platform, and a named </w:t>
+        <w:t xml:space="preserve"> (one of them is the primary leader for the platform), and a named </w:t>
       </w:r>
       <w:r>
         <w:rPr>
@@ -356,7 +350,25 @@
         <w:t>child safety officer</w:t>
       </w:r>
       <w:r>
-        <w:t xml:space="preserve"> (required: the Organization will not enrol any child until one is named in Schedule B, has completed vAI's leader training and has signed the code of conduct).</w:t>
+        <w:t xml:space="preserve"> (required: the Organization will not enrol any child until one is named in Schedule B, has completed vAI's leader training and has signed the code of conduct). In Schedule B the Organization gives vAI the </w:t>
+      </w:r>
+      <w:r>
+        <w:rPr>
+          <w:b/>
+        </w:rPr>
+        <w:t>name and email of its site leader or leaders</w:t>
+      </w:r>
+      <w:r>
+        <w:t xml:space="preserve"> and the </w:t>
+      </w:r>
+      <w:r>
+        <w:rPr>
+          <w:b/>
+        </w:rPr>
+        <w:t>name, email and WhatsApp number of its child safety officer</w:t>
+      </w:r>
+      <w:r>
+        <w:t xml:space="preserve">, and tells vAI at once if any of them changes.</w:t>
       </w:r>
     </w:p>
     <w:p>
@@ -1101,10 +1113,10 @@
         <w:rPr>
           <w:b/>
         </w:rPr>
-        <w:t>Assignment to Impact Mining, Inc.</w:t>
+        <w:t>Assignment.</w:t>
       </w:r>
       <w:r>
-        <w:t xml:space="preserve"> vAI may assign this agreement to Impact Mining, Inc. when it is formed, on written notice, and the Organization agrees. Otherwise neither side may assign it without the other's written consent.</w:t>
+        <w:t xml:space="preserve"> Neither side may assign this agreement without the other's written consent.</w:t>
       </w:r>
     </w:p>
     <w:p>
@@ -1176,7 +1188,7 @@
         <w:t>vAI</w:t>
       </w:r>
       <w:r>
-        <w:t>: ______________________  Name: Kevin Hallinan   Title: Founder, nextVillage.community Date: ____________</w:t>
+        <w:t>: ______________________  Name: Mr. Bennywhite Davidson   Title: Leader, Davidson AI Futures Lab Date: ____________</w:t>
       </w:r>
     </w:p>
     <w:p>
@@ -1630,9 +1642,16 @@
             </w:r>
             <w:r>
               <w:rPr>
+                <w:b/>
                 <w:sz w:val="18"/>
               </w:rPr>
-              <w:t>Primary leader (name, email, WhatsApp/phone)</w:t>
+              <w:t>Site leader or leaders (required)</w:t>
+            </w:r>
+            <w:r>
+              <w:rPr>
+                <w:sz w:val="18"/>
+              </w:rPr>
+              <w:t xml:space="preserve"> (name and email of each; mark the primary leader for the platform)</w:t>
             </w:r>
           </w:p>
         </w:tc>
@@ -1703,7 +1722,20 @@
               <w:rPr>
                 <w:sz w:val="18"/>
               </w:rPr>
-              <w:t xml:space="preserve"> (name, email, WhatsApp/phone)</w:t>
+              <w:t xml:space="preserve"> (name, email and </w:t>
+            </w:r>
+            <w:r>
+              <w:rPr>
+                <w:b/>
+                <w:sz w:val="18"/>
+              </w:rPr>
+              <w:t>WhatsApp number</w:t>
+            </w:r>
+            <w:r>
+              <w:rPr>
+                <w:sz w:val="18"/>
+              </w:rPr>
+              <w:t>)</w:t>
             </w:r>
           </w:p>
         </w:tc>

</xml_diff>

<commit_message>
Partnership agreement: vAI party is the Davidson AI Futures Lab (Mr. Bennywhite Davidson, Oloibiri); drop Impact Mining assignment; require site leader and child safety officer contacts incl. safety officer WhatsApp (#313)
Co-authored-by: Claude Sonnet 5.5 <noreply@anthropic.com>
</commit_message>
<xml_diff>
--- a/docs/forms/Partnership agreement.docx
+++ b/docs/forms/Partnership agreement.docx
@@ -47,22 +47,25 @@
     </w:p>
     <w:p>
       <w:r>
-        <w:rPr>
-          <w:b/>
-        </w:rPr>
-        <w:t>vAI</w:t>
-      </w:r>
-      <w:r>
-        <w:t xml:space="preserve">, the nextVillage.community program, run by </w:t>
+        <w:t xml:space="preserve">The </w:t>
       </w:r>
       <w:r>
         <w:rPr>
           <w:b/>
         </w:rPr>
-        <w:t>Kevin Hallinan</w:t>
+        <w:t>Davidson AI Futures Lab</w:t>
       </w:r>
       <w:r>
-        <w:t>, 1629 E. 4th St., Dayton, OH 45403, USA, with the Davidson AI Futures Lab, Oloibiri, Bayelsa State, Nigeria ("</w:t>
+        <w:t xml:space="preserve">, of Oloibiri, Bayelsa State, Nigeria, led by </w:t>
+      </w:r>
+      <w:r>
+        <w:rPr>
+          <w:b/>
+        </w:rPr>
+        <w:t>Mr. Bennywhite Davidson</w:t>
+      </w:r>
+      <w:r>
+        <w:t xml:space="preserve">, which runs the nextVillage.community program ("</w:t>
       </w:r>
       <w:r>
         <w:rPr>
@@ -71,16 +74,7 @@
         <w:t>vAI</w:t>
       </w:r>
       <w:r>
-        <w:t xml:space="preserve">"). vAI expects to assign this agreement to </w:t>
-      </w:r>
-      <w:r>
-        <w:rPr>
-          <w:b/>
-        </w:rPr>
-        <w:t>Impact Mining, Inc.</w:t>
-      </w:r>
-      <w:r>
-        <w:t>, an Ohio nonprofit now being formed, and the Organization agrees to that assignment (clause 14);</w:t>
+        <w:t xml:space="preserve">");</w:t>
       </w:r>
     </w:p>
     <w:p>
@@ -338,16 +332,16 @@
         <w:t>lead mentor</w:t>
       </w:r>
       <w:r>
-        <w:t xml:space="preserve"> from the Organization who is present when learners are, a named </w:t>
+        <w:t xml:space="preserve"> from the Organization who is present when learners are, one or more named </w:t>
       </w:r>
       <w:r>
         <w:rPr>
           <w:b/>
         </w:rPr>
-        <w:t>primary leader</w:t>
+        <w:t>site leaders</w:t>
       </w:r>
       <w:r>
-        <w:t xml:space="preserve"> for the platform, and a named </w:t>
+        <w:t xml:space="preserve"> (one of them is the primary leader for the platform), and a named </w:t>
       </w:r>
       <w:r>
         <w:rPr>
@@ -356,7 +350,25 @@
         <w:t>child safety officer</w:t>
       </w:r>
       <w:r>
-        <w:t xml:space="preserve"> (required: the Organization will not enrol any child until one is named in Schedule B, has completed vAI's leader training and has signed the code of conduct).</w:t>
+        <w:t xml:space="preserve"> (required: the Organization will not enrol any child until one is named in Schedule B, has completed vAI's leader training and has signed the code of conduct). In Schedule B the Organization gives vAI the </w:t>
+      </w:r>
+      <w:r>
+        <w:rPr>
+          <w:b/>
+        </w:rPr>
+        <w:t>name and email of its site leader or leaders</w:t>
+      </w:r>
+      <w:r>
+        <w:t xml:space="preserve"> and the </w:t>
+      </w:r>
+      <w:r>
+        <w:rPr>
+          <w:b/>
+        </w:rPr>
+        <w:t>name, email and WhatsApp number of its child safety officer</w:t>
+      </w:r>
+      <w:r>
+        <w:t xml:space="preserve">, and tells vAI at once if any of them changes.</w:t>
       </w:r>
     </w:p>
     <w:p>
@@ -1101,10 +1113,10 @@
         <w:rPr>
           <w:b/>
         </w:rPr>
-        <w:t>Assignment to Impact Mining, Inc.</w:t>
+        <w:t>Assignment.</w:t>
       </w:r>
       <w:r>
-        <w:t xml:space="preserve"> vAI may assign this agreement to Impact Mining, Inc. when it is formed, on written notice, and the Organization agrees. Otherwise neither side may assign it without the other's written consent.</w:t>
+        <w:t xml:space="preserve"> Neither side may assign this agreement without the other's written consent.</w:t>
       </w:r>
     </w:p>
     <w:p>
@@ -1176,7 +1188,7 @@
         <w:t>vAI</w:t>
       </w:r>
       <w:r>
-        <w:t>: ______________________  Name: Kevin Hallinan   Title: Founder, nextVillage.community Date: ____________</w:t>
+        <w:t>: ______________________  Name: Mr. Bennywhite Davidson   Title: Leader, Davidson AI Futures Lab Date: ____________</w:t>
       </w:r>
     </w:p>
     <w:p>
@@ -1630,9 +1642,16 @@
             </w:r>
             <w:r>
               <w:rPr>
+                <w:b/>
                 <w:sz w:val="18"/>
               </w:rPr>
-              <w:t>Primary leader (name, email, WhatsApp/phone)</w:t>
+              <w:t>Site leader or leaders (required)</w:t>
+            </w:r>
+            <w:r>
+              <w:rPr>
+                <w:sz w:val="18"/>
+              </w:rPr>
+              <w:t xml:space="preserve"> (name and email of each; mark the primary leader for the platform)</w:t>
             </w:r>
           </w:p>
         </w:tc>
@@ -1703,7 +1722,20 @@
               <w:rPr>
                 <w:sz w:val="18"/>
               </w:rPr>
-              <w:t xml:space="preserve"> (name, email, WhatsApp/phone)</w:t>
+              <w:t xml:space="preserve"> (name, email and </w:t>
+            </w:r>
+            <w:r>
+              <w:rPr>
+                <w:b/>
+                <w:sz w:val="18"/>
+              </w:rPr>
+              <w:t>WhatsApp number</w:t>
+            </w:r>
+            <w:r>
+              <w:rPr>
+                <w:sz w:val="18"/>
+              </w:rPr>
+              <w:t>)</w:t>
             </w:r>
           </w:p>
         </w:tc>

</xml_diff>